<commit_message>
updated cv to include website
</commit_message>
<xml_diff>
--- a/pdf/Harris_Nisar_CV.docx
+++ b/pdf/Harris_Nisar_CV.docx
@@ -71,17 +71,9 @@
                   <w:sz w:val="23"/>
                   <w:szCs w:val="23"/>
                 </w:rPr>
-                <w:t>nisar2@illinois.edu</w:t>
+                <w:t>harrisnisar@gmail.com</w:t>
               </w:r>
             </w:hyperlink>
-            <w:r>
-              <w:rPr>
-                <w:rFonts w:ascii="Times New Roman" w:hAnsi="Times New Roman" w:cs="Times New Roman"/>
-                <w:sz w:val="23"/>
-                <w:szCs w:val="23"/>
-              </w:rPr>
-              <w:t xml:space="preserve"> </w:t>
-            </w:r>
             <w:r>
               <w:rPr>
                 <w:rFonts w:ascii="Times New Roman" w:hAnsi="Times New Roman" w:cs="Times New Roman"/>
@@ -125,6 +117,41 @@
               </w:rPr>
             </w:pPr>
             <w:hyperlink r:id="rId7" w:history="1">
+              <w:r>
+                <w:rPr>
+                  <w:rStyle w:val="Hyperlink"/>
+                  <w:rFonts w:ascii="Times New Roman" w:hAnsi="Times New Roman" w:cs="Times New Roman"/>
+                  <w:sz w:val="23"/>
+                  <w:szCs w:val="23"/>
+                </w:rPr>
+                <w:t>harrisnisar.com</w:t>
+              </w:r>
+            </w:hyperlink>
+            <w:r>
+              <w:rPr>
+                <w:rFonts w:ascii="Times New Roman" w:hAnsi="Times New Roman" w:cs="Times New Roman"/>
+                <w:sz w:val="23"/>
+                <w:szCs w:val="23"/>
+              </w:rPr>
+              <w:t xml:space="preserve"> </w:t>
+            </w:r>
+            <w:r>
+              <w:rPr>
+                <w:rFonts w:ascii="Times New Roman" w:hAnsi="Times New Roman" w:cs="Times New Roman"/>
+                <w:sz w:val="23"/>
+                <w:szCs w:val="23"/>
+              </w:rPr>
+              <w:t>|</w:t>
+            </w:r>
+            <w:r>
+              <w:rPr>
+                <w:rFonts w:ascii="Times New Roman" w:hAnsi="Times New Roman" w:cs="Times New Roman"/>
+                <w:sz w:val="23"/>
+                <w:szCs w:val="23"/>
+              </w:rPr>
+              <w:t xml:space="preserve"> </w:t>
+            </w:r>
+            <w:hyperlink r:id="rId8" w:history="1">
               <w:r>
                 <w:rPr>
                   <w:rStyle w:val="Hyperlink"/>
@@ -150,18 +177,35 @@
               </w:rPr>
               <w:t xml:space="preserve">| </w:t>
             </w:r>
-            <w:hyperlink r:id="rId8" w:history="1">
-              <w:r>
-                <w:rPr>
-                  <w:rStyle w:val="Hyperlink"/>
-                  <w:rFonts w:ascii="Times New Roman" w:hAnsi="Times New Roman" w:cs="Times New Roman"/>
-                  <w:sz w:val="23"/>
-                  <w:szCs w:val="23"/>
-                  <w:u w:val="none"/>
-                </w:rPr>
-                <w:t>GitHub</w:t>
-              </w:r>
-            </w:hyperlink>
+            <w:r>
+              <w:fldChar w:fldCharType="begin"/>
+            </w:r>
+            <w:r>
+              <w:instrText>HYPERLINK "https://github.com/nisar2"</w:instrText>
+            </w:r>
+            <w:r>
+              <w:fldChar w:fldCharType="separate"/>
+            </w:r>
+            <w:r>
+              <w:rPr>
+                <w:rStyle w:val="Hyperlink"/>
+                <w:rFonts w:ascii="Times New Roman" w:hAnsi="Times New Roman" w:cs="Times New Roman"/>
+                <w:sz w:val="23"/>
+                <w:szCs w:val="23"/>
+                <w:u w:val="none"/>
+              </w:rPr>
+              <w:t>GitHub</w:t>
+            </w:r>
+            <w:r>
+              <w:rPr>
+                <w:rStyle w:val="Hyperlink"/>
+                <w:rFonts w:ascii="Times New Roman" w:hAnsi="Times New Roman" w:cs="Times New Roman"/>
+                <w:sz w:val="23"/>
+                <w:szCs w:val="23"/>
+                <w:u w:val="none"/>
+              </w:rPr>
+              <w:fldChar w:fldCharType="end"/>
+            </w:r>
             <w:r>
               <w:rPr>
                 <w:rFonts w:ascii="Times New Roman" w:hAnsi="Times New Roman" w:cs="Times New Roman"/>
@@ -2460,17 +2504,7 @@
                 <w:sz w:val="21"/>
                 <w:szCs w:val="21"/>
               </w:rPr>
-              <w:t>Translating Behavioral Interventions into Virtual Reality: The Transcend Framework for Immersive Health Design</w:t>
-            </w:r>
-            <w:r>
-              <w:rPr>
-                <w:rFonts w:ascii="Times New Roman" w:hAnsi="Times New Roman" w:cs="Times New Roman"/>
-                <w:b/>
-                <w:bCs/>
-                <w:sz w:val="21"/>
-                <w:szCs w:val="21"/>
-              </w:rPr>
-              <w:t>,</w:t>
+              <w:t>Translating Behavioral Interventions into Virtual Reality: The Transcend Framework for Immersive Health Design,</w:t>
             </w:r>
             <w:r>
               <w:rPr>

</xml_diff>

<commit_message>
updated grad date on cv
</commit_message>
<xml_diff>
--- a/pdf/Harris_Nisar_CV.docx
+++ b/pdf/Harris_Nisar_CV.docx
@@ -194,7 +194,6 @@
                   <w:rFonts w:ascii="Times New Roman" w:hAnsi="Times New Roman" w:cs="Times New Roman"/>
                   <w:sz w:val="23"/>
                   <w:szCs w:val="23"/>
-                  <w:u w:val="none"/>
                 </w:rPr>
                 <w:t>GitHub</w:t>
               </w:r>
@@ -214,7 +213,6 @@
                   <w:rFonts w:ascii="Times New Roman" w:hAnsi="Times New Roman" w:cs="Times New Roman"/>
                   <w:sz w:val="23"/>
                   <w:szCs w:val="23"/>
-                  <w:u w:val="none"/>
                 </w:rPr>
                 <w:t>LinkedIn</w:t>
               </w:r>
@@ -373,7 +371,27 @@
                 <w:sz w:val="21"/>
                 <w:szCs w:val="21"/>
               </w:rPr>
-              <w:t>Jan 2023 - Dec 2026</w:t>
+              <w:t xml:space="preserve">Jan 2023 - </w:t>
+            </w:r>
+            <w:r>
+              <w:rPr>
+                <w:rFonts w:ascii="Times New Roman" w:hAnsi="Times New Roman" w:cs="Times New Roman"/>
+                <w:b/>
+                <w:bCs/>
+                <w:sz w:val="21"/>
+                <w:szCs w:val="21"/>
+              </w:rPr>
+              <w:t>May</w:t>
+            </w:r>
+            <w:r>
+              <w:rPr>
+                <w:rFonts w:ascii="Times New Roman" w:hAnsi="Times New Roman" w:cs="Times New Roman"/>
+                <w:b/>
+                <w:bCs/>
+                <w:sz w:val="21"/>
+                <w:szCs w:val="21"/>
+              </w:rPr>
+              <w:t xml:space="preserve"> 2026</w:t>
             </w:r>
           </w:p>
           <w:p>

</xml_diff>

<commit_message>
updated cv for graduating with phd
</commit_message>
<xml_diff>
--- a/pdf/Harris_Nisar_CV.docx
+++ b/pdf/Harris_Nisar_CV.docx
@@ -294,7 +294,7 @@
                 <w:sz w:val="21"/>
                 <w:szCs w:val="21"/>
               </w:rPr>
-              <w:t>PhD Candidate in Industrial Engineering, CSL</w:t>
+              <w:t>PhD in Industrial Engineering, CSL</w:t>
             </w:r>
           </w:p>
           <w:p>
@@ -381,7 +381,7 @@
                 <w:sz w:val="21"/>
                 <w:szCs w:val="21"/>
               </w:rPr>
-              <w:t>May</w:t>
+              <w:t>April</w:t>
             </w:r>
             <w:r>
               <w:rPr>
@@ -786,7 +786,37 @@
                 <w:sz w:val="21"/>
                 <w:szCs w:val="21"/>
               </w:rPr>
-              <w:t xml:space="preserve">Jan 2023 – Present </w:t>
+              <w:t xml:space="preserve">Jan 2023 – </w:t>
+            </w:r>
+            <w:r>
+              <w:rPr>
+                <w:rFonts w:ascii="Times New Roman" w:hAnsi="Times New Roman" w:cs="Times New Roman"/>
+                <w:b/>
+                <w:bCs/>
+                <w:sz w:val="21"/>
+                <w:szCs w:val="21"/>
+              </w:rPr>
+              <w:t>April</w:t>
+            </w:r>
+            <w:r>
+              <w:rPr>
+                <w:rFonts w:ascii="Times New Roman" w:hAnsi="Times New Roman" w:cs="Times New Roman"/>
+                <w:b/>
+                <w:bCs/>
+                <w:sz w:val="21"/>
+                <w:szCs w:val="21"/>
+              </w:rPr>
+              <w:t xml:space="preserve"> 2026</w:t>
+            </w:r>
+            <w:r>
+              <w:rPr>
+                <w:rFonts w:ascii="Times New Roman" w:hAnsi="Times New Roman" w:cs="Times New Roman"/>
+                <w:b/>
+                <w:bCs/>
+                <w:sz w:val="21"/>
+                <w:szCs w:val="21"/>
+              </w:rPr>
+              <w:t xml:space="preserve"> </w:t>
             </w:r>
           </w:p>
         </w:tc>
@@ -1099,7 +1129,27 @@
                 <w:sz w:val="21"/>
                 <w:szCs w:val="21"/>
               </w:rPr>
-              <w:t xml:space="preserve">June 2025 – Present </w:t>
+              <w:t xml:space="preserve">June 2025 – </w:t>
+            </w:r>
+            <w:r>
+              <w:rPr>
+                <w:rFonts w:ascii="Times New Roman" w:hAnsi="Times New Roman" w:cs="Times New Roman"/>
+                <w:b/>
+                <w:bCs/>
+                <w:sz w:val="21"/>
+                <w:szCs w:val="21"/>
+              </w:rPr>
+              <w:t>April 2026</w:t>
+            </w:r>
+            <w:r>
+              <w:rPr>
+                <w:rFonts w:ascii="Times New Roman" w:hAnsi="Times New Roman" w:cs="Times New Roman"/>
+                <w:b/>
+                <w:bCs/>
+                <w:sz w:val="21"/>
+                <w:szCs w:val="21"/>
+              </w:rPr>
+              <w:t xml:space="preserve"> </w:t>
             </w:r>
           </w:p>
         </w:tc>

</xml_diff>